<commit_message>
Stack Figure 19.3 (a) and (b) side by side horizontally
</commit_message>
<xml_diff>
--- a/notes/class 11/Ch19_ChemicalCoordinationAndIntegration/Ch19_ChemicalCoordinationAndIntegration.docx
+++ b/notes/class 11/Ch19_ChemicalCoordinationAndIntegration/Ch19_ChemicalCoordinationAndIntegration.docx
@@ -7698,119 +7698,301 @@
         <w:t xml:space="preserve"> in the thyroid.</w:t>
       </w:r>
     </w:p>
+    <w:tbl>
+      <w:tblPr>
+        <w:tblW w:type="auto" w:w="0"/>
+        <w:jc w:val="center"/>
+        <w:tblLayout w:type="fixed"/>
+        <w:tblLook w:firstColumn="1" w:firstRow="1" w:lastColumn="0" w:lastRow="0" w:noHBand="0" w:noVBand="1" w:val="04A0"/>
+        <w:tblBorders>
+          <w:top w:val="none"/>
+          <w:left w:val="none"/>
+          <w:bottom w:val="none"/>
+          <w:right w:val="none"/>
+          <w:insideH w:val="none"/>
+          <w:insideV w:val="none"/>
+        </w:tblBorders>
+      </w:tblPr>
+      <w:tblGrid>
+        <w:gridCol w:w="5102"/>
+        <w:gridCol w:w="5102"/>
+      </w:tblGrid>
+      <w:tr>
+        <w:tc>
+          <w:tcPr>
+            <w:tcW w:type="dxa" w:w="5103"/>
+            <w:vAlign w:val="bottom"/>
+            <w:tcMar>
+              <w:top w:w="60" w:type="dxa"/>
+              <w:bottom w:w="60" w:type="dxa"/>
+              <w:left w:w="60" w:type="dxa"/>
+              <w:right w:w="60" w:type="dxa"/>
+            </w:tcMar>
+          </w:tcPr>
+          <w:p>
+            <w:pPr>
+              <w:keepNext/>
+              <w:spacing w:before="0" w:after="40"/>
+              <w:jc w:val="center"/>
+            </w:pPr>
+            <w:r>
+              <w:drawing>
+                <wp:inline xmlns:a="http://schemas.openxmlformats.org/drawingml/2006/main" xmlns:pic="http://schemas.openxmlformats.org/drawingml/2006/picture">
+                  <wp:extent cx="2231996" cy="2459823"/>
+                  <wp:docPr id="3" name="Picture 3"/>
+                  <wp:cNvGraphicFramePr>
+                    <a:graphicFrameLocks noChangeAspect="1"/>
+                  </wp:cNvGraphicFramePr>
+                  <a:graphic>
+                    <a:graphicData uri="http://schemas.openxmlformats.org/drawingml/2006/picture">
+                      <pic:pic>
+                        <pic:nvPicPr>
+                          <pic:cNvPr id="0" name="fig_19_3a.png"/>
+                          <pic:cNvPicPr/>
+                        </pic:nvPicPr>
+                        <pic:blipFill>
+                          <a:blip r:embed="rId11"/>
+                          <a:stretch>
+                            <a:fillRect/>
+                          </a:stretch>
+                        </pic:blipFill>
+                        <pic:spPr>
+                          <a:xfrm>
+                            <a:off x="0" y="0"/>
+                            <a:ext cx="2231996" cy="2459823"/>
+                          </a:xfrm>
+                          <a:prstGeom prst="rect"/>
+                        </pic:spPr>
+                      </pic:pic>
+                    </a:graphicData>
+                  </a:graphic>
+                </wp:inline>
+              </w:drawing>
+            </w:r>
+          </w:p>
+        </w:tc>
+        <w:tc>
+          <w:tcPr>
+            <w:tcW w:type="dxa" w:w="5103"/>
+            <w:vAlign w:val="bottom"/>
+            <w:tcMar>
+              <w:top w:w="60" w:type="dxa"/>
+              <w:bottom w:w="60" w:type="dxa"/>
+              <w:left w:w="60" w:type="dxa"/>
+              <w:right w:w="60" w:type="dxa"/>
+            </w:tcMar>
+          </w:tcPr>
+          <w:p>
+            <w:pPr>
+              <w:keepNext/>
+              <w:spacing w:before="0" w:after="40"/>
+              <w:jc w:val="center"/>
+            </w:pPr>
+            <w:r>
+              <w:drawing>
+                <wp:inline xmlns:a="http://schemas.openxmlformats.org/drawingml/2006/main" xmlns:pic="http://schemas.openxmlformats.org/drawingml/2006/picture">
+                  <wp:extent cx="2231996" cy="2334774"/>
+                  <wp:docPr id="4" name="Picture 4"/>
+                  <wp:cNvGraphicFramePr>
+                    <a:graphicFrameLocks noChangeAspect="1"/>
+                  </wp:cNvGraphicFramePr>
+                  <a:graphic>
+                    <a:graphicData uri="http://schemas.openxmlformats.org/drawingml/2006/picture">
+                      <pic:pic>
+                        <pic:nvPicPr>
+                          <pic:cNvPr id="0" name="fig_19_3b.png"/>
+                          <pic:cNvPicPr/>
+                        </pic:nvPicPr>
+                        <pic:blipFill>
+                          <a:blip r:embed="rId12"/>
+                          <a:stretch>
+                            <a:fillRect/>
+                          </a:stretch>
+                        </pic:blipFill>
+                        <pic:spPr>
+                          <a:xfrm>
+                            <a:off x="0" y="0"/>
+                            <a:ext cx="2231996" cy="2334774"/>
+                          </a:xfrm>
+                          <a:prstGeom prst="rect"/>
+                        </pic:spPr>
+                      </pic:pic>
+                    </a:graphicData>
+                  </a:graphic>
+                </wp:inline>
+              </w:drawing>
+            </w:r>
+          </w:p>
+        </w:tc>
+      </w:tr>
+    </w:tbl>
     <w:p>
       <w:pPr>
-        <w:keepNext/>
-        <w:spacing w:before="120" w:after="40"/>
+        <w:spacing w:before="0" w:after="120"/>
+      </w:pPr>
+    </w:p>
+    <w:tbl>
+      <w:tblPr>
+        <w:tblW w:type="auto" w:w="0"/>
         <w:jc w:val="center"/>
-      </w:pPr>
-      <w:r>
-        <w:drawing>
-          <wp:inline xmlns:a="http://schemas.openxmlformats.org/drawingml/2006/main" xmlns:pic="http://schemas.openxmlformats.org/drawingml/2006/picture">
-            <wp:extent cx="1907997" cy="2102753"/>
-            <wp:docPr id="3" name="Picture 3"/>
-            <wp:cNvGraphicFramePr>
-              <a:graphicFrameLocks noChangeAspect="1"/>
-            </wp:cNvGraphicFramePr>
-            <a:graphic>
-              <a:graphicData uri="http://schemas.openxmlformats.org/drawingml/2006/picture">
-                <pic:pic>
-                  <pic:nvPicPr>
-                    <pic:cNvPr id="0" name="fig_19_3a.png"/>
-                    <pic:cNvPicPr/>
-                  </pic:nvPicPr>
-                  <pic:blipFill>
-                    <a:blip r:embed="rId11"/>
-                    <a:stretch>
-                      <a:fillRect/>
-                    </a:stretch>
-                  </pic:blipFill>
-                  <pic:spPr>
-                    <a:xfrm>
-                      <a:off x="0" y="0"/>
-                      <a:ext cx="1907997" cy="2102753"/>
-                    </a:xfrm>
-                    <a:prstGeom prst="rect"/>
-                  </pic:spPr>
-                </pic:pic>
-              </a:graphicData>
-            </a:graphic>
-          </wp:inline>
-        </w:drawing>
-      </w:r>
-    </w:p>
+        <w:tblLayout w:type="fixed"/>
+        <w:tblLook w:firstColumn="1" w:firstRow="1" w:lastColumn="0" w:lastRow="0" w:noHBand="0" w:noVBand="1" w:val="04A0"/>
+        <w:tblBorders>
+          <w:top w:val="none"/>
+          <w:left w:val="single" w:sz="16" w:space="0" w:color="1F2937"/>
+          <w:bottom w:val="none"/>
+          <w:right w:val="none"/>
+          <w:insideH w:val="none"/>
+          <w:insideV w:val="none"/>
+        </w:tblBorders>
+      </w:tblPr>
+      <w:tblGrid>
+        <w:gridCol w:w="10205"/>
+      </w:tblGrid>
+      <w:tr>
+        <w:tc>
+          <w:tcPr>
+            <w:tcW w:type="dxa" w:w="10206"/>
+            <w:shd w:fill="F9FAFB"/>
+            <w:tcMar>
+              <w:top w:w="100" w:type="dxa"/>
+              <w:bottom w:w="100" w:type="dxa"/>
+              <w:left w:w="150" w:type="dxa"/>
+              <w:right w:w="150" w:type="dxa"/>
+            </w:tcMar>
+          </w:tcPr>
+          <w:p>
+            <w:pPr>
+              <w:spacing w:before="0" w:after="0" w:line="276" w:lineRule="auto"/>
+            </w:pPr>
+            <w:r>
+              <w:rPr>
+                <w:rFonts w:ascii="Times New Roman" w:hAnsi="Times New Roman"/>
+                <w:b/>
+                <w:i w:val="0"/>
+                <w:color w:val="1F2937"/>
+                <w:sz w:val="20"/>
+              </w:rPr>
+              <w:t>[NOTE]</w:t>
+            </w:r>
+            <w:r>
+              <w:rPr>
+                <w:rFonts w:ascii="Times New Roman" w:hAnsi="Times New Roman"/>
+                <w:b w:val="0"/>
+                <w:i w:val="0"/>
+                <w:color w:val="1F2937"/>
+                <w:sz w:val="20"/>
+              </w:rPr>
+              <w:t xml:space="preserve"> </w:t>
+            </w:r>
+            <w:r>
+              <w:rPr>
+                <w:rFonts w:ascii="Times New Roman" w:hAnsi="Times New Roman"/>
+                <w:b/>
+                <w:i w:val="0"/>
+                <w:color w:val="1F2937"/>
+                <w:sz w:val="20"/>
+              </w:rPr>
+              <w:t>Reading Figure 19.3:</w:t>
+            </w:r>
+            <w:r>
+              <w:rPr>
+                <w:rFonts w:ascii="Times New Roman" w:hAnsi="Times New Roman"/>
+                <w:b w:val="0"/>
+                <w:i w:val="0"/>
+                <w:color w:val="1F2937"/>
+                <w:sz w:val="20"/>
+              </w:rPr>
+              <w:t xml:space="preserve"> On the ventral side (a), the </w:t>
+            </w:r>
+            <w:r>
+              <w:rPr>
+                <w:rFonts w:ascii="Times New Roman" w:hAnsi="Times New Roman"/>
+                <w:b/>
+                <w:i w:val="0"/>
+                <w:color w:val="1F2937"/>
+                <w:sz w:val="20"/>
+              </w:rPr>
+              <w:t>vocal cord</w:t>
+            </w:r>
+            <w:r>
+              <w:rPr>
+                <w:rFonts w:ascii="Times New Roman" w:hAnsi="Times New Roman"/>
+                <w:b w:val="0"/>
+                <w:i w:val="0"/>
+                <w:color w:val="1F2937"/>
+                <w:sz w:val="20"/>
+              </w:rPr>
+              <w:t xml:space="preserve">, </w:t>
+            </w:r>
+            <w:r>
+              <w:rPr>
+                <w:rFonts w:ascii="Times New Roman" w:hAnsi="Times New Roman"/>
+                <w:b/>
+                <w:i w:val="0"/>
+                <w:color w:val="1F2937"/>
+                <w:sz w:val="20"/>
+              </w:rPr>
+              <w:t>thyroid</w:t>
+            </w:r>
+            <w:r>
+              <w:rPr>
+                <w:rFonts w:ascii="Times New Roman" w:hAnsi="Times New Roman"/>
+                <w:b w:val="0"/>
+                <w:i w:val="0"/>
+                <w:color w:val="1F2937"/>
+                <w:sz w:val="20"/>
+              </w:rPr>
+              <w:t xml:space="preserve">, and </w:t>
+            </w:r>
+            <w:r>
+              <w:rPr>
+                <w:rFonts w:ascii="Times New Roman" w:hAnsi="Times New Roman"/>
+                <w:b/>
+                <w:i w:val="0"/>
+                <w:color w:val="1F2937"/>
+                <w:sz w:val="20"/>
+              </w:rPr>
+              <w:t>trachea</w:t>
+            </w:r>
+            <w:r>
+              <w:rPr>
+                <w:rFonts w:ascii="Times New Roman" w:hAnsi="Times New Roman"/>
+                <w:b w:val="0"/>
+                <w:i w:val="0"/>
+                <w:color w:val="1F2937"/>
+                <w:sz w:val="20"/>
+              </w:rPr>
+              <w:t xml:space="preserve"> are shown. On the dorsal side (b), the four </w:t>
+            </w:r>
+            <w:r>
+              <w:rPr>
+                <w:rFonts w:ascii="Times New Roman" w:hAnsi="Times New Roman"/>
+                <w:b/>
+                <w:i w:val="0"/>
+                <w:color w:val="1F2937"/>
+                <w:sz w:val="20"/>
+              </w:rPr>
+              <w:t>parathyroid glands</w:t>
+            </w:r>
+            <w:r>
+              <w:rPr>
+                <w:rFonts w:ascii="Times New Roman" w:hAnsi="Times New Roman"/>
+                <w:b w:val="0"/>
+                <w:i w:val="0"/>
+                <w:color w:val="1F2937"/>
+                <w:sz w:val="20"/>
+              </w:rPr>
+              <w:t xml:space="preserve"> are embedded on the posterior surface of the thyroid lobes.</w:t>
+            </w:r>
+          </w:p>
+        </w:tc>
+      </w:tr>
+    </w:tbl>
     <w:p>
       <w:pPr>
-        <w:spacing w:before="40" w:after="160"/>
-        <w:jc w:val="center"/>
+        <w:spacing w:before="0" w:after="120"/>
       </w:pPr>
-      <w:r>
-        <w:rPr>
-          <w:rFonts w:ascii="Times New Roman" w:hAnsi="Times New Roman"/>
-          <w:b w:val="0"/>
-          <w:i/>
-          <w:color w:val="4B5563"/>
-          <w:sz w:val="18"/>
-        </w:rPr>
-        <w:t>Figure 19.3 Diagrammatic view of the position of Thyroid and Parathyroid (a) Ventral side</w:t>
-      </w:r>
-    </w:p>
-    <w:p>
-      <w:pPr>
-        <w:keepNext/>
-        <w:spacing w:before="120" w:after="40"/>
-        <w:jc w:val="center"/>
-      </w:pPr>
-      <w:r>
-        <w:drawing>
-          <wp:inline xmlns:a="http://schemas.openxmlformats.org/drawingml/2006/main" xmlns:pic="http://schemas.openxmlformats.org/drawingml/2006/picture">
-            <wp:extent cx="1907997" cy="1995856"/>
-            <wp:docPr id="4" name="Picture 4"/>
-            <wp:cNvGraphicFramePr>
-              <a:graphicFrameLocks noChangeAspect="1"/>
-            </wp:cNvGraphicFramePr>
-            <a:graphic>
-              <a:graphicData uri="http://schemas.openxmlformats.org/drawingml/2006/picture">
-                <pic:pic>
-                  <pic:nvPicPr>
-                    <pic:cNvPr id="0" name="fig_19_3b.png"/>
-                    <pic:cNvPicPr/>
-                  </pic:nvPicPr>
-                  <pic:blipFill>
-                    <a:blip r:embed="rId12"/>
-                    <a:stretch>
-                      <a:fillRect/>
-                    </a:stretch>
-                  </pic:blipFill>
-                  <pic:spPr>
-                    <a:xfrm>
-                      <a:off x="0" y="0"/>
-                      <a:ext cx="1907997" cy="1995856"/>
-                    </a:xfrm>
-                    <a:prstGeom prst="rect"/>
-                  </pic:spPr>
-                </pic:pic>
-              </a:graphicData>
-            </a:graphic>
-          </wp:inline>
-        </w:drawing>
-      </w:r>
-    </w:p>
-    <w:p>
-      <w:pPr>
-        <w:spacing w:before="40" w:after="160"/>
-        <w:jc w:val="center"/>
-      </w:pPr>
-      <w:r>
-        <w:rPr>
-          <w:rFonts w:ascii="Times New Roman" w:hAnsi="Times New Roman"/>
-          <w:b w:val="0"/>
-          <w:i/>
-          <w:color w:val="4B5563"/>
-          <w:sz w:val="18"/>
-        </w:rPr>
-        <w:t>Figure 19.3 Diagrammatic view of the position of Thyroid and Parathyroid (b) Dorsal side</w:t>
-      </w:r>
     </w:p>
     <w:p>
       <w:pPr>
@@ -19858,6 +20040,229 @@
         </w:rPr>
         <w:t>Figure 19.5 Diagramatic representation of the mechanism of hormone action : (b) Steroid hormone</w:t>
       </w:r>
+    </w:p>
+    <w:tbl>
+      <w:tblPr>
+        <w:tblW w:type="auto" w:w="0"/>
+        <w:jc w:val="center"/>
+        <w:tblLayout w:type="fixed"/>
+        <w:tblLook w:firstColumn="1" w:firstRow="1" w:lastColumn="0" w:lastRow="0" w:noHBand="0" w:noVBand="1" w:val="04A0"/>
+        <w:tblBorders>
+          <w:top w:val="none"/>
+          <w:left w:val="single" w:sz="16" w:space="0" w:color="1F2937"/>
+          <w:bottom w:val="none"/>
+          <w:right w:val="none"/>
+          <w:insideH w:val="none"/>
+          <w:insideV w:val="none"/>
+        </w:tblBorders>
+      </w:tblPr>
+      <w:tblGrid>
+        <w:gridCol w:w="10205"/>
+      </w:tblGrid>
+      <w:tr>
+        <w:tc>
+          <w:tcPr>
+            <w:tcW w:type="dxa" w:w="10206"/>
+            <w:shd w:fill="F9FAFB"/>
+            <w:tcMar>
+              <w:top w:w="100" w:type="dxa"/>
+              <w:bottom w:w="100" w:type="dxa"/>
+              <w:left w:w="150" w:type="dxa"/>
+              <w:right w:w="150" w:type="dxa"/>
+            </w:tcMar>
+          </w:tcPr>
+          <w:p>
+            <w:pPr>
+              <w:spacing w:before="0" w:after="0" w:line="276" w:lineRule="auto"/>
+            </w:pPr>
+            <w:r>
+              <w:rPr>
+                <w:rFonts w:ascii="Times New Roman" w:hAnsi="Times New Roman"/>
+                <w:b/>
+                <w:i w:val="0"/>
+                <w:color w:val="1F2937"/>
+                <w:sz w:val="20"/>
+              </w:rPr>
+              <w:t>[NOTE]</w:t>
+            </w:r>
+            <w:r>
+              <w:rPr>
+                <w:rFonts w:ascii="Times New Roman" w:hAnsi="Times New Roman"/>
+                <w:b w:val="0"/>
+                <w:i w:val="0"/>
+                <w:color w:val="1F2937"/>
+                <w:sz w:val="20"/>
+              </w:rPr>
+              <w:t xml:space="preserve"> </w:t>
+            </w:r>
+            <w:r>
+              <w:rPr>
+                <w:rFonts w:ascii="Times New Roman" w:hAnsi="Times New Roman"/>
+                <w:b/>
+                <w:i w:val="0"/>
+                <w:color w:val="1F2937"/>
+                <w:sz w:val="20"/>
+              </w:rPr>
+              <w:t>Reading Figure 19.5 (b):</w:t>
+            </w:r>
+            <w:r>
+              <w:rPr>
+                <w:rFonts w:ascii="Times New Roman" w:hAnsi="Times New Roman"/>
+                <w:b w:val="0"/>
+                <w:i w:val="0"/>
+                <w:color w:val="1F2937"/>
+                <w:sz w:val="20"/>
+              </w:rPr>
+              <w:t xml:space="preserve"> The steroid hormone (e.g., estrogen) enters through the </w:t>
+            </w:r>
+            <w:r>
+              <w:rPr>
+                <w:rFonts w:ascii="Times New Roman" w:hAnsi="Times New Roman"/>
+                <w:b/>
+                <w:i w:val="0"/>
+                <w:color w:val="1F2937"/>
+                <w:sz w:val="20"/>
+              </w:rPr>
+              <w:t>uterine cell membrane</w:t>
+            </w:r>
+            <w:r>
+              <w:rPr>
+                <w:rFonts w:ascii="Times New Roman" w:hAnsi="Times New Roman"/>
+                <w:b w:val="0"/>
+                <w:i w:val="0"/>
+                <w:color w:val="1F2937"/>
+                <w:sz w:val="20"/>
+              </w:rPr>
+              <w:t xml:space="preserve"> into the </w:t>
+            </w:r>
+            <w:r>
+              <w:rPr>
+                <w:rFonts w:ascii="Times New Roman" w:hAnsi="Times New Roman"/>
+                <w:b/>
+                <w:i w:val="0"/>
+                <w:color w:val="1F2937"/>
+                <w:sz w:val="20"/>
+              </w:rPr>
+              <w:t>nucleus</w:t>
+            </w:r>
+            <w:r>
+              <w:rPr>
+                <w:rFonts w:ascii="Times New Roman" w:hAnsi="Times New Roman"/>
+                <w:b w:val="0"/>
+                <w:i w:val="0"/>
+                <w:color w:val="1F2937"/>
+                <w:sz w:val="20"/>
+              </w:rPr>
+              <w:t xml:space="preserve">, forming a </w:t>
+            </w:r>
+            <w:r>
+              <w:rPr>
+                <w:rFonts w:ascii="Times New Roman" w:hAnsi="Times New Roman"/>
+                <w:b/>
+                <w:i w:val="0"/>
+                <w:color w:val="1F2937"/>
+                <w:sz w:val="20"/>
+              </w:rPr>
+              <w:t>hormone-receptor complex</w:t>
+            </w:r>
+            <w:r>
+              <w:rPr>
+                <w:rFonts w:ascii="Times New Roman" w:hAnsi="Times New Roman"/>
+                <w:b w:val="0"/>
+                <w:i w:val="0"/>
+                <w:color w:val="1F2937"/>
+                <w:sz w:val="20"/>
+              </w:rPr>
+              <w:t xml:space="preserve"> with intracellular receptors that interacts with the </w:t>
+            </w:r>
+            <w:r>
+              <w:rPr>
+                <w:rFonts w:ascii="Times New Roman" w:hAnsi="Times New Roman"/>
+                <w:b/>
+                <w:i w:val="0"/>
+                <w:color w:val="1F2937"/>
+                <w:sz w:val="20"/>
+              </w:rPr>
+              <w:t>genome</w:t>
+            </w:r>
+            <w:r>
+              <w:rPr>
+                <w:rFonts w:ascii="Times New Roman" w:hAnsi="Times New Roman"/>
+                <w:b w:val="0"/>
+                <w:i w:val="0"/>
+                <w:color w:val="1F2937"/>
+                <w:sz w:val="20"/>
+              </w:rPr>
+              <w:t xml:space="preserve"> to produce </w:t>
+            </w:r>
+            <w:r>
+              <w:rPr>
+                <w:rFonts w:ascii="Times New Roman" w:hAnsi="Times New Roman"/>
+                <w:b/>
+                <w:i w:val="0"/>
+                <w:color w:val="1F2937"/>
+                <w:sz w:val="20"/>
+              </w:rPr>
+              <w:t>mRNA</w:t>
+            </w:r>
+            <w:r>
+              <w:rPr>
+                <w:rFonts w:ascii="Times New Roman" w:hAnsi="Times New Roman"/>
+                <w:b w:val="0"/>
+                <w:i w:val="0"/>
+                <w:color w:val="1F2937"/>
+                <w:sz w:val="20"/>
+              </w:rPr>
+              <w:t xml:space="preserve"> and </w:t>
+            </w:r>
+            <w:r>
+              <w:rPr>
+                <w:rFonts w:ascii="Times New Roman" w:hAnsi="Times New Roman"/>
+                <w:b/>
+                <w:i w:val="0"/>
+                <w:color w:val="1F2937"/>
+                <w:sz w:val="20"/>
+              </w:rPr>
+              <w:t>proteins</w:t>
+            </w:r>
+            <w:r>
+              <w:rPr>
+                <w:rFonts w:ascii="Times New Roman" w:hAnsi="Times New Roman"/>
+                <w:b w:val="0"/>
+                <w:i w:val="0"/>
+                <w:color w:val="1F2937"/>
+                <w:sz w:val="20"/>
+              </w:rPr>
+              <w:t xml:space="preserve">, resulting in </w:t>
+            </w:r>
+            <w:r>
+              <w:rPr>
+                <w:rFonts w:ascii="Times New Roman" w:hAnsi="Times New Roman"/>
+                <w:b/>
+                <w:i w:val="0"/>
+                <w:color w:val="1F2937"/>
+                <w:sz w:val="20"/>
+              </w:rPr>
+              <w:t>physiological responses (tissue growth and differentiation)</w:t>
+            </w:r>
+            <w:r>
+              <w:rPr>
+                <w:rFonts w:ascii="Times New Roman" w:hAnsi="Times New Roman"/>
+                <w:b w:val="0"/>
+                <w:i w:val="0"/>
+                <w:color w:val="1F2937"/>
+                <w:sz w:val="20"/>
+              </w:rPr>
+              <w:t>.</w:t>
+            </w:r>
+          </w:p>
+        </w:tc>
+      </w:tr>
+    </w:tbl>
+    <w:p>
+      <w:pPr>
+        <w:spacing w:before="0" w:after="120"/>
+      </w:pPr>
     </w:p>
     <w:tbl>
       <w:tblPr>

</xml_diff>

<commit_message>
Merge Figure 19.3 (a) and (b) assets into single horizontally stacked image fig_19_3.png
</commit_message>
<xml_diff>
--- a/notes/class 11/Ch19_ChemicalCoordinationAndIntegration/Ch19_ChemicalCoordinationAndIntegration.docx
+++ b/notes/class 11/Ch19_ChemicalCoordinationAndIntegration/Ch19_ChemicalCoordinationAndIntegration.docx
@@ -7698,138 +7698,62 @@
         <w:t xml:space="preserve"> in the thyroid.</w:t>
       </w:r>
     </w:p>
-    <w:tbl>
-      <w:tblPr>
-        <w:tblW w:type="auto" w:w="0"/>
-        <w:jc w:val="center"/>
-        <w:tblLayout w:type="fixed"/>
-        <w:tblLook w:firstColumn="1" w:firstRow="1" w:lastColumn="0" w:lastRow="0" w:noHBand="0" w:noVBand="1" w:val="04A0"/>
-        <w:tblBorders>
-          <w:top w:val="none"/>
-          <w:left w:val="none"/>
-          <w:bottom w:val="none"/>
-          <w:right w:val="none"/>
-          <w:insideH w:val="none"/>
-          <w:insideV w:val="none"/>
-        </w:tblBorders>
-      </w:tblPr>
-      <w:tblGrid>
-        <w:gridCol w:w="5102"/>
-        <w:gridCol w:w="5102"/>
-      </w:tblGrid>
-      <w:tr>
-        <w:tc>
-          <w:tcPr>
-            <w:tcW w:type="dxa" w:w="5103"/>
-            <w:vAlign w:val="bottom"/>
-            <w:tcMar>
-              <w:top w:w="60" w:type="dxa"/>
-              <w:bottom w:w="60" w:type="dxa"/>
-              <w:left w:w="60" w:type="dxa"/>
-              <w:right w:w="60" w:type="dxa"/>
-            </w:tcMar>
-          </w:tcPr>
-          <w:p>
-            <w:pPr>
-              <w:keepNext/>
-              <w:spacing w:before="0" w:after="40"/>
-              <w:jc w:val="center"/>
-            </w:pPr>
-            <w:r>
-              <w:drawing>
-                <wp:inline xmlns:a="http://schemas.openxmlformats.org/drawingml/2006/main" xmlns:pic="http://schemas.openxmlformats.org/drawingml/2006/picture">
-                  <wp:extent cx="2231996" cy="2459823"/>
-                  <wp:docPr id="3" name="Picture 3"/>
-                  <wp:cNvGraphicFramePr>
-                    <a:graphicFrameLocks noChangeAspect="1"/>
-                  </wp:cNvGraphicFramePr>
-                  <a:graphic>
-                    <a:graphicData uri="http://schemas.openxmlformats.org/drawingml/2006/picture">
-                      <pic:pic>
-                        <pic:nvPicPr>
-                          <pic:cNvPr id="0" name="fig_19_3a.png"/>
-                          <pic:cNvPicPr/>
-                        </pic:nvPicPr>
-                        <pic:blipFill>
-                          <a:blip r:embed="rId11"/>
-                          <a:stretch>
-                            <a:fillRect/>
-                          </a:stretch>
-                        </pic:blipFill>
-                        <pic:spPr>
-                          <a:xfrm>
-                            <a:off x="0" y="0"/>
-                            <a:ext cx="2231996" cy="2459823"/>
-                          </a:xfrm>
-                          <a:prstGeom prst="rect"/>
-                        </pic:spPr>
-                      </pic:pic>
-                    </a:graphicData>
-                  </a:graphic>
-                </wp:inline>
-              </w:drawing>
-            </w:r>
-          </w:p>
-        </w:tc>
-        <w:tc>
-          <w:tcPr>
-            <w:tcW w:type="dxa" w:w="5103"/>
-            <w:vAlign w:val="bottom"/>
-            <w:tcMar>
-              <w:top w:w="60" w:type="dxa"/>
-              <w:bottom w:w="60" w:type="dxa"/>
-              <w:left w:w="60" w:type="dxa"/>
-              <w:right w:w="60" w:type="dxa"/>
-            </w:tcMar>
-          </w:tcPr>
-          <w:p>
-            <w:pPr>
-              <w:keepNext/>
-              <w:spacing w:before="0" w:after="40"/>
-              <w:jc w:val="center"/>
-            </w:pPr>
-            <w:r>
-              <w:drawing>
-                <wp:inline xmlns:a="http://schemas.openxmlformats.org/drawingml/2006/main" xmlns:pic="http://schemas.openxmlformats.org/drawingml/2006/picture">
-                  <wp:extent cx="2231996" cy="2334774"/>
-                  <wp:docPr id="4" name="Picture 4"/>
-                  <wp:cNvGraphicFramePr>
-                    <a:graphicFrameLocks noChangeAspect="1"/>
-                  </wp:cNvGraphicFramePr>
-                  <a:graphic>
-                    <a:graphicData uri="http://schemas.openxmlformats.org/drawingml/2006/picture">
-                      <pic:pic>
-                        <pic:nvPicPr>
-                          <pic:cNvPr id="0" name="fig_19_3b.png"/>
-                          <pic:cNvPicPr/>
-                        </pic:nvPicPr>
-                        <pic:blipFill>
-                          <a:blip r:embed="rId12"/>
-                          <a:stretch>
-                            <a:fillRect/>
-                          </a:stretch>
-                        </pic:blipFill>
-                        <pic:spPr>
-                          <a:xfrm>
-                            <a:off x="0" y="0"/>
-                            <a:ext cx="2231996" cy="2334774"/>
-                          </a:xfrm>
-                          <a:prstGeom prst="rect"/>
-                        </pic:spPr>
-                      </pic:pic>
-                    </a:graphicData>
-                  </a:graphic>
-                </wp:inline>
-              </w:drawing>
-            </w:r>
-          </w:p>
-        </w:tc>
-      </w:tr>
-    </w:tbl>
     <w:p>
       <w:pPr>
-        <w:spacing w:before="0" w:after="120"/>
+        <w:keepNext/>
+        <w:spacing w:before="120" w:after="40"/>
+        <w:jc w:val="center"/>
       </w:pPr>
+      <w:r>
+        <w:drawing>
+          <wp:inline xmlns:a="http://schemas.openxmlformats.org/drawingml/2006/main" xmlns:pic="http://schemas.openxmlformats.org/drawingml/2006/picture">
+            <wp:extent cx="4679992" cy="2471436"/>
+            <wp:docPr id="3" name="Picture 3"/>
+            <wp:cNvGraphicFramePr>
+              <a:graphicFrameLocks noChangeAspect="1"/>
+            </wp:cNvGraphicFramePr>
+            <a:graphic>
+              <a:graphicData uri="http://schemas.openxmlformats.org/drawingml/2006/picture">
+                <pic:pic>
+                  <pic:nvPicPr>
+                    <pic:cNvPr id="0" name="fig_19_3.png"/>
+                    <pic:cNvPicPr/>
+                  </pic:nvPicPr>
+                  <pic:blipFill>
+                    <a:blip r:embed="rId11"/>
+                    <a:stretch>
+                      <a:fillRect/>
+                    </a:stretch>
+                  </pic:blipFill>
+                  <pic:spPr>
+                    <a:xfrm>
+                      <a:off x="0" y="0"/>
+                      <a:ext cx="4679992" cy="2471436"/>
+                    </a:xfrm>
+                    <a:prstGeom prst="rect"/>
+                  </pic:spPr>
+                </pic:pic>
+              </a:graphicData>
+            </a:graphic>
+          </wp:inline>
+        </w:drawing>
+      </w:r>
+    </w:p>
+    <w:p>
+      <w:pPr>
+        <w:spacing w:before="40" w:after="160"/>
+        <w:jc w:val="center"/>
+      </w:pPr>
+      <w:r>
+        <w:rPr>
+          <w:rFonts w:ascii="Times New Roman" w:hAnsi="Times New Roman"/>
+          <w:b w:val="0"/>
+          <w:i/>
+          <w:color w:val="4B5563"/>
+          <w:sz w:val="18"/>
+        </w:rPr>
+        <w:t>Figure 19.3 Diagrammatic view of the position of Thyroid and Parathyroid (a) Ventral side (b) Dorsal side</w:t>
+      </w:r>
     </w:p>
     <w:tbl>
       <w:tblPr>
@@ -10517,7 +10441,7 @@
         <w:drawing>
           <wp:inline xmlns:a="http://schemas.openxmlformats.org/drawingml/2006/main" xmlns:pic="http://schemas.openxmlformats.org/drawingml/2006/picture">
             <wp:extent cx="2987995" cy="2196868"/>
-            <wp:docPr id="5" name="Picture 5"/>
+            <wp:docPr id="4" name="Picture 4"/>
             <wp:cNvGraphicFramePr>
               <a:graphicFrameLocks noChangeAspect="1"/>
             </wp:cNvGraphicFramePr>
@@ -10529,7 +10453,7 @@
                     <pic:cNvPicPr/>
                   </pic:nvPicPr>
                   <pic:blipFill>
-                    <a:blip r:embed="rId13"/>
+                    <a:blip r:embed="rId12"/>
                     <a:stretch>
                       <a:fillRect/>
                     </a:stretch>
@@ -19937,7 +19861,7 @@
         <w:drawing>
           <wp:inline xmlns:a="http://schemas.openxmlformats.org/drawingml/2006/main" xmlns:pic="http://schemas.openxmlformats.org/drawingml/2006/picture">
             <wp:extent cx="3923994" cy="2181870"/>
-            <wp:docPr id="6" name="Picture 6"/>
+            <wp:docPr id="5" name="Picture 5"/>
             <wp:cNvGraphicFramePr>
               <a:graphicFrameLocks noChangeAspect="1"/>
             </wp:cNvGraphicFramePr>
@@ -19949,7 +19873,7 @@
                     <pic:cNvPicPr/>
                   </pic:nvPicPr>
                   <pic:blipFill>
-                    <a:blip r:embed="rId14"/>
+                    <a:blip r:embed="rId13"/>
                     <a:stretch>
                       <a:fillRect/>
                     </a:stretch>
@@ -19994,7 +19918,7 @@
         <w:drawing>
           <wp:inline xmlns:a="http://schemas.openxmlformats.org/drawingml/2006/main" xmlns:pic="http://schemas.openxmlformats.org/drawingml/2006/picture">
             <wp:extent cx="3923994" cy="2952393"/>
-            <wp:docPr id="7" name="Picture 7"/>
+            <wp:docPr id="6" name="Picture 6"/>
             <wp:cNvGraphicFramePr>
               <a:graphicFrameLocks noChangeAspect="1"/>
             </wp:cNvGraphicFramePr>
@@ -20006,7 +19930,7 @@
                     <pic:cNvPicPr/>
                   </pic:nvPicPr>
                   <pic:blipFill>
-                    <a:blip r:embed="rId15"/>
+                    <a:blip r:embed="rId14"/>
                     <a:stretch>
                       <a:fillRect/>
                     </a:stretch>

</xml_diff>